<commit_message>
Netinho: revisão da Parte 3
Co-Authored-By: Claude Opus 5.5 <noreply@anthropic.com>
Claude-Session: https://claude.ai/code/session_01MJjUEEZrxQDEUifKK2vj9g
</commit_message>
<xml_diff>
--- a/roteiros/netinho/Netinho_Parte3.docx
+++ b/roteiros/netinho/Netinho_Parte3.docx
@@ -151,7 +151,7 @@
         <w:rPr>
           <w:color w:val="000000"/>
         </w:rPr>
-        <w:t>Insuficiência renal. Falência de vários órgãos. Guarde essas palavras. Porque, treze anos depois, em outubro de dois mil e vinte e seis, elas iam aparecer de novo. Dessa vez, na nota que comunicou a morte dele.</w:t>
+        <w:t>Insuficiência renal. Vários órgãos parando ao mesmo tempo. Guarde essas palavras. Porque, treze anos depois, em outubro de dois mil e vinte e seis, palavras muito parecidas iam aparecer de novo. Dessa vez, na nota que comunicou a morte dele.</w:t>
       </w:r>
     </w:p>
     <w:p>
@@ -175,7 +175,7 @@
         <w:rPr>
           <w:color w:val="000000"/>
         </w:rPr>
-        <w:t>Segundo reportagens da época, ele chegou a perder mais de trinta quilos. Ele, que antes de tudo aquilo, como contou no Domingão do Faustão, não sabia nem o que era uma dor de cabeça.</w:t>
+        <w:t>Segundo a imprensa, naquela crise ele chegou a perder mais de trinta quilos. Ele, que antes de tudo aquilo, como contou no Domingão do Faustão, não sabia nem o que era uma dor de cabeça.</w:t>
       </w:r>
     </w:p>
     <w:p>
@@ -255,7 +255,7 @@
         <w:rPr>
           <w:color w:val="000000"/>
         </w:rPr>
-        <w:t>E disse outra frase que os fãs nunca esqueceram. "Sou também de Salvador, de Santo Antônio de Jesus, de São Paulo, de Recife, sou do mundo inteiro."</w:t>
+        <w:t>E disse outra frase que resume quem ele era. "Sou também de Salvador, de Santo Antônio de Jesus, de São Paulo, de Recife, sou do mundo inteiro."</w:t>
       </w:r>
     </w:p>
     <w:p>
@@ -335,6 +335,14 @@
         <w:rPr>
           <w:color w:val="000000"/>
         </w:rPr>
+        <w:t>Guarde esse sentimento. Porque, nove anos depois, já lutando pela vida, ele ia sonhar com um show ainda maior. Um show batizado com o ano em que ele nasceu. Nós vamos chegar lá.</w:t>
+      </w:r>
+    </w:p>
+    <w:p>
+      <w:r>
+        <w:rPr>
+          <w:color w:val="000000"/>
+        </w:rPr>
         <w:t>Os anos seguintes trouxeram outras turbulências. E nem todas eram de saúde.</w:t>
       </w:r>
     </w:p>
@@ -383,7 +391,7 @@
         <w:rPr>
           <w:color w:val="000000"/>
         </w:rPr>
-        <w:t>E é aqui que a história volta para aquele dia que eu pedi para você guardar.</w:t>
+        <w:t>E é aqui que a história volta para aquele fevereiro de dois mil e vinte e cinco. Lembra? Os dias em que ele achou que era só mais uma sequela.</w:t>
       </w:r>
     </w:p>
     <w:p>
@@ -391,7 +399,7 @@
         <w:rPr>
           <w:color w:val="000000"/>
         </w:rPr>
-        <w:t>Fevereiro de dois mil e vinte e cinco. O Netinho estava animado. Tinha feito sete shows em janeiro e fevereiro. No fim de semana anterior, tinha cantado em Pernambuco e em Alagoas. E tinha seis apresentações marcadas para o Carnaval, em cinco dias seguidos.</w:t>
+        <w:t>Fevereiro de dois mil e vinte e cinco. A agenda do Netinho estava cheia. Ele tinha feito sete shows em janeiro e fevereiro. No fim de semana anterior, tinha cantado em Pernambuco e em Alagoas. E tinha seis apresentações marcadas para o Carnaval, em cinco dias seguidos.</w:t>
       </w:r>
     </w:p>
     <w:p>
@@ -471,7 +479,7 @@
         <w:rPr>
           <w:color w:val="000000"/>
         </w:rPr>
-        <w:t>Dias depois, o Netinho publicou uma frase que deixou os fãs sem fôlego. "Já concluí a primeira bateria de exames e já tenho um diagnóstico."</w:t>
+        <w:t>Dias depois, o Netinho publicou uma frase que deixou os fãs apreensivos. "Já concluí a primeira bateria de exames e já tenho um diagnóstico."</w:t>
       </w:r>
     </w:p>
     <w:p>

</xml_diff>